<commit_message>
Update single progress logs and documentation with remaining tasks and project outlook sections
</commit_message>
<xml_diff>
--- a/WEEKLY_PROGRESS_LOG.docx
+++ b/WEEKLY_PROGRESS_LOG.docx
@@ -3027,6 +3027,112 @@
       </w:r>
       <w:r>
         <w:t>Full database deployment and backend API gateway wiring.</w:t>
+      </w:r>
+    </w:p>
+    <w:p>
+      <w:r>
+        <w:br w:type="page"/>
+      </w:r>
+    </w:p>
+    <w:p>
+      <w:pPr>
+        <w:pStyle w:val="Title"/>
+      </w:pPr>
+      <w:r>
+        <w:t>PROJECT OUTLOOK &amp; REMAINING TASKS</w:t>
+      </w:r>
+    </w:p>
+    <w:p>
+      <w:r>
+        <w:t>While the frontend and UI/UX flows are 100% complete, there are a few critical milestones left before the final launch of ShopEase Nepal:</w:t>
+      </w:r>
+    </w:p>
+    <w:p>
+      <w:pPr>
+        <w:pStyle w:val="Heading1"/>
+      </w:pPr>
+      <w:r>
+        <w:t>1. Database Architecture &amp; Setup</w:t>
+      </w:r>
+    </w:p>
+    <w:p>
+      <w:pPr>
+        <w:pStyle w:val="ListBullet"/>
+      </w:pPr>
+      <w:r>
+        <w:t>Designing and provisioning the primary relational database (e.g., MySQL or PostgreSQL) to store users, products, orders, and wishlist data.</w:t>
+      </w:r>
+    </w:p>
+    <w:p>
+      <w:pPr>
+        <w:pStyle w:val="ListBullet"/>
+      </w:pPr>
+      <w:r>
+        <w:t>Establishing secure connections and data models mapping directly to the frontend schemas.</w:t>
+      </w:r>
+    </w:p>
+    <w:p>
+      <w:pPr>
+        <w:pStyle w:val="Heading1"/>
+      </w:pPr>
+      <w:r>
+        <w:t>2. Backend REST API Integration</w:t>
+      </w:r>
+    </w:p>
+    <w:p>
+      <w:pPr>
+        <w:pStyle w:val="ListBullet"/>
+      </w:pPr>
+      <w:r>
+        <w:t>Currently, the application relies on mock static data and local storage for authentication, cart, and product management. The next major phase will connect the frontend to a live backend database.</w:t>
+      </w:r>
+    </w:p>
+    <w:p>
+      <w:pPr>
+        <w:pStyle w:val="ListBullet"/>
+      </w:pPr>
+      <w:r>
+        <w:t>Endpoints to integrate include: User Auth, Admin Product CRUD, Order Processing, and Wishlist syncing.</w:t>
+      </w:r>
+    </w:p>
+    <w:p>
+      <w:pPr>
+        <w:pStyle w:val="Heading1"/>
+      </w:pPr>
+      <w:r>
+        <w:t>3. Payment Gateway Setup</w:t>
+      </w:r>
+    </w:p>
+    <w:p>
+      <w:pPr>
+        <w:pStyle w:val="ListBullet"/>
+      </w:pPr>
+      <w:r>
+        <w:t>Integrating Khalti and e-Sewa payment APIs to process real transactions during the checkout flow.</w:t>
+      </w:r>
+    </w:p>
+    <w:p>
+      <w:pPr>
+        <w:pStyle w:val="Heading1"/>
+      </w:pPr>
+      <w:r>
+        <w:t>4. Production Deployment</w:t>
+      </w:r>
+    </w:p>
+    <w:p>
+      <w:pPr>
+        <w:pStyle w:val="ListBullet"/>
+      </w:pPr>
+      <w:r>
+        <w:t>Configuring GitHub Pages or a dedicated hosting environment (like Vercel/Netlify) for public access.</w:t>
+      </w:r>
+    </w:p>
+    <w:p>
+      <w:pPr>
+        <w:pStyle w:val="ListBullet"/>
+      </w:pPr>
+      <w:r>
+        <w:t>Setting up automated CI/CD pipelines via GitHub Actions for continuous deployment.</w:t>
       </w:r>
     </w:p>
     <w:sectPr>

</xml_diff>

<commit_message>
feat: integrate FastAPI SQLite backend and configure Firebase options
</commit_message>
<xml_diff>
--- a/WEEKLY_PROGRESS_LOG.docx
+++ b/WEEKLY_PROGRESS_LOG.docx
@@ -3575,6 +3575,153 @@
       <w:r>
         <w:br w:type="page"/>
       </w:r>
+    </w:p>
+    <w:p>
+      <w:pPr>
+        <w:pStyle w:val="Title"/>
+      </w:pPr>
+      <w:r>
+        <w:t>WEEKLY PROGRESS LOG - WEEK 9</w:t>
+      </w:r>
+    </w:p>
+    <w:p>
+      <w:pPr/>
+      <w:r>
+        <w:t>Project Title: ShopEase Nepal (Ecommerce Platform)</w:t>
+      </w:r>
+    </w:p>
+    <w:p>
+      <w:pPr/>
+      <w:r>
+        <w:t>Current Phase: User Profiles &amp; Dashboard Review Management</w:t>
+      </w:r>
+    </w:p>
+    <w:p>
+      <w:pPr/>
+      <w:r>
+        <w:t>Overall Progress: 100% Complete (Enhancements)</w:t>
+      </w:r>
+    </w:p>
+    <w:p>
+      <w:pPr>
+        <w:pStyle w:val="Heading1"/>
+      </w:pPr>
+      <w:r>
+        <w:t>1. TASKS COMPLETED</w:t>
+      </w:r>
+    </w:p>
+    <w:p>
+      <w:pPr>
+        <w:pStyle w:val="ListBullet"/>
+      </w:pPr>
+      <w:r>
+        <w:t>Profile Avatars: Implemented Canvas-based profile avatar upload (200x200px compressed) and A-Z/0-9 preset avatar generators in both user profiles and dashboards.</w:t>
+      </w:r>
+    </w:p>
+    <w:p>
+      <w:pPr>
+        <w:pStyle w:val="ListBullet"/>
+      </w:pPr>
+      <w:r>
+        <w:t>Store Reviews: Added a global Reviews tab to the Admin Dashboard and a product-specific Reviews tab to the Seller Dashboard.</w:t>
+      </w:r>
+    </w:p>
+    <w:p>
+      <w:pPr>
+        <w:pStyle w:val="ListBullet"/>
+      </w:pPr>
+      <w:r>
+        <w:t>Avatar Integration: Integrated custom profile pictures inside review cards and the global store header.</w:t>
+      </w:r>
+    </w:p>
+    <w:p>
+      <w:pPr>
+        <w:pStyle w:val="ListBullet"/>
+      </w:pPr>
+      <w:r>
+        <w:t>UI &amp; Navigation Polish: Relocated logout from the main store navbar to sidebar dashboard links, fixed button legibility during dark theme, and enabled responsive tab scrolling.</w:t>
+      </w:r>
+    </w:p>
+    <w:p>
+      <w:pPr>
+        <w:pStyle w:val="Heading1"/>
+      </w:pPr>
+      <w:r>
+        <w:t>2. CHALLENGES</w:t>
+      </w:r>
+    </w:p>
+    <w:p>
+      <w:pPr>
+        <w:pStyle w:val="ListBullet"/>
+      </w:pPr>
+      <w:r>
+        <w:t>LocalStorage Limitations: Preserving avatar quality while saving data-URLs to the limited 5MB localStorage.</w:t>
+      </w:r>
+    </w:p>
+    <w:p>
+      <w:pPr>
+        <w:pStyle w:val="ListBullet"/>
+      </w:pPr>
+      <w:r>
+        <w:t>Dashboard Access: Scoping reviews based on whether user is logged in as user, sub-admin, or admin.</w:t>
+      </w:r>
+    </w:p>
+    <w:p>
+      <w:pPr>
+        <w:pStyle w:val="Heading1"/>
+      </w:pPr>
+      <w:r>
+        <w:t>3. SOLUTIONS</w:t>
+      </w:r>
+    </w:p>
+    <w:p>
+      <w:pPr>
+        <w:pStyle w:val="ListBullet"/>
+      </w:pPr>
+      <w:r>
+        <w:t>Canvas Compression: Used HTML5 Canvas to automatically compress images to 200x200px JPEGs before saving.</w:t>
+      </w:r>
+    </w:p>
+    <w:p>
+      <w:pPr>
+        <w:pStyle w:val="ListBullet"/>
+      </w:pPr>
+      <w:r>
+        <w:t>Scoped Views: Segmented product reviews by ownership for the Seller Dashboard, while showing all reviews for the Admin Dashboard.</w:t>
+      </w:r>
+    </w:p>
+    <w:p>
+      <w:pPr>
+        <w:pStyle w:val="Heading1"/>
+      </w:pPr>
+      <w:r>
+        <w:t>4. INDIVIDUAL TASK CONTRIBUTIONS</w:t>
+      </w:r>
+    </w:p>
+    <w:p>
+      <w:pPr>
+        <w:pStyle w:val="Heading1"/>
+      </w:pPr>
+      <w:r>
+        <w:t>5. LEADERSHIP REVIEW &amp; STATUS REPORT</w:t>
+      </w:r>
+    </w:p>
+    <w:p>
+      <w:pPr/>
+      <w:r>
+        <w:t>The project successfully completed Week 9. The team focused on user profiles &amp; dashboard review management, resolving storage and scoped visualization challenges.</w:t>
+      </w:r>
+    </w:p>
+    <w:p>
+      <w:pPr/>
+      <w:r>
+        <w:t>Current Status: 100% Complete (Enhancements)</w:t>
+        <w:br/>
+        <w:t>Next Milestone: Proceed to backend API integration.</w:t>
+      </w:r>
+    </w:p>
+    <w:p>
+      <w:pPr/>
     </w:p>
     <w:p>
       <w:pPr>

</xml_diff>

<commit_message>
feat: implement full-stack e-commerce architecture including Firebase Cloud Functions, product context, SQL schema, and dashboard pages
</commit_message>
<xml_diff>
--- a/WEEKLY_PROGRESS_LOG.docx
+++ b/WEEKLY_PROGRESS_LOG.docx
@@ -3725,38 +3725,343 @@
     </w:p>
     <w:p>
       <w:pPr>
-        <w:pStyle w:val="Title"/>
+        <w:pStyle w:val="Heading2"/>
+        <w:pageBreakBefore/>
+      </w:pPr>
+      <w:r>
+        <w:t>Week 10: Cloud Database and Media Hosting Migration</w:t>
+      </w:r>
+    </w:p>
+    <w:p>
+      <w:r>
         <w:rPr>
-          <w:color w:val="auto"/>
+          <w:b/>
         </w:rPr>
-      </w:pPr>
-      <w:r>
-        <w:rPr>
-          <w:color w:val="auto"/>
-        </w:rPr>
-        <w:lastRenderedPageBreak/>
+        <w:t xml:space="preserve">Status: </w:t>
+      </w:r>
+      <w:r>
+        <w:t>90% Complete</w:t>
+      </w:r>
+    </w:p>
+    <w:p>
+      <w:pPr>
+        <w:pStyle w:val="Heading3"/>
+      </w:pPr>
+      <w:r>
+        <w:t>Tasks Completed</w:t>
+      </w:r>
+    </w:p>
+    <w:p>
+      <w:pPr>
+        <w:pStyle w:val="ListBullet"/>
+      </w:pPr>
+      <w:r>
+        <w:t>Database Migration: Transitioned the entire application from localStorage mock data to live Firebase Firestore.</w:t>
+      </w:r>
+    </w:p>
+    <w:p>
+      <w:pPr>
+        <w:pStyle w:val="ListBullet"/>
+      </w:pPr>
+      <w:r>
+        <w:t>Image Hosting: Integrated Cloudinary API to replace Base64 strings with direct, secure image uploads from the Admin and Seller dashboards.</w:t>
+      </w:r>
+    </w:p>
+    <w:p>
+      <w:pPr>
+        <w:pStyle w:val="ListBullet"/>
+      </w:pPr>
+      <w:r>
+        <w:t>Refactored contexts: Updated ProductContext and AuthContext to fetch and sync data with Firestore in real-time.</w:t>
+      </w:r>
+    </w:p>
+    <w:p>
+      <w:pPr>
+        <w:pStyle w:val="ListBullet"/>
+      </w:pPr>
+      <w:r>
+        <w:t>Updated Data Models: Stripped out unsupported object types (like File objects) before payload submission to Firestore.</w:t>
+      </w:r>
+    </w:p>
+    <w:p>
+      <w:pPr>
+        <w:pStyle w:val="Heading3"/>
+      </w:pPr>
+      <w:r>
+        <w:t>Challenges</w:t>
+      </w:r>
+    </w:p>
+    <w:p>
+      <w:pPr>
+        <w:pStyle w:val="ListBullet"/>
+      </w:pPr>
+      <w:r>
+        <w:t>Handling asynchronous operations with Firebase alongside React state updates.</w:t>
+      </w:r>
+    </w:p>
+    <w:p>
+      <w:pPr>
+        <w:pStyle w:val="ListBullet"/>
+      </w:pPr>
+      <w:r>
+        <w:t>Ensuring Vite properly loaded .env variables for Cloudinary API integration.</w:t>
+      </w:r>
+    </w:p>
+    <w:p>
+      <w:pPr>
+        <w:pStyle w:val="Heading3"/>
+      </w:pPr>
+      <w:r>
+        <w:t>Solutions</w:t>
+      </w:r>
+    </w:p>
+    <w:p>
+      <w:pPr>
+        <w:pStyle w:val="ListBullet"/>
+      </w:pPr>
+      <w:r>
+        <w:t>Enforced strict payload cleaning before database writes.</w:t>
+      </w:r>
+    </w:p>
+    <w:p>
+      <w:pPr>
+        <w:pStyle w:val="ListBullet"/>
+      </w:pPr>
+      <w:r>
+        <w:t>Restarted development server environments to ensure variables were successfully injected into the application context.</w:t>
+      </w:r>
+    </w:p>
+    <w:p>
+      <w:pPr>
+        <w:pStyle w:val="Heading3"/>
+      </w:pPr>
+      <w:r>
+        <w:t>Team Contributions</w:t>
+      </w:r>
+    </w:p>
+    <w:tbl>
+      <w:tblPr>
+        <w:tblStyle w:val="TableGrid"/>
+        <w:tblW w:type="auto" w:w="0"/>
+        <w:tblLook w:firstColumn="1" w:firstRow="1" w:lastColumn="0" w:lastRow="0" w:noHBand="0" w:noVBand="1" w:val="04A0"/>
+      </w:tblPr>
+      <w:tblGrid>
+        <w:gridCol w:w="2880"/>
+        <w:gridCol w:w="2880"/>
+        <w:gridCol w:w="2880"/>
+      </w:tblGrid>
+      <w:tr>
+        <w:tc>
+          <w:tcPr>
+            <w:tcW w:type="dxa" w:w="2880"/>
+          </w:tcPr>
+          <w:p>
+            <w:r>
+              <w:t>Member</w:t>
+            </w:r>
+          </w:p>
+        </w:tc>
+        <w:tc>
+          <w:tcPr>
+            <w:tcW w:type="dxa" w:w="2880"/>
+          </w:tcPr>
+          <w:p>
+            <w:r>
+              <w:t>Focus Area</w:t>
+            </w:r>
+          </w:p>
+        </w:tc>
+        <w:tc>
+          <w:tcPr>
+            <w:tcW w:type="dxa" w:w="2880"/>
+          </w:tcPr>
+          <w:p>
+            <w:r>
+              <w:t>Deliverables</w:t>
+            </w:r>
+          </w:p>
+        </w:tc>
+      </w:tr>
+      <w:tr>
+        <w:tc>
+          <w:tcPr>
+            <w:tcW w:type="dxa" w:w="2880"/>
+          </w:tcPr>
+          <w:p>
+            <w:r>
+              <w:t>Anmol Chhetri (Lead)</w:t>
+            </w:r>
+          </w:p>
+        </w:tc>
+        <w:tc>
+          <w:tcPr>
+            <w:tcW w:type="dxa" w:w="2880"/>
+          </w:tcPr>
+          <w:p>
+            <w:r>
+              <w:t>Infrastructure</w:t>
+            </w:r>
+          </w:p>
+        </w:tc>
+        <w:tc>
+          <w:tcPr>
+            <w:tcW w:type="dxa" w:w="2880"/>
+          </w:tcPr>
+          <w:p>
+            <w:r>
+              <w:t>Managed Firebase NoSQL structure and Cloudinary integration architecture.</w:t>
+            </w:r>
+          </w:p>
+        </w:tc>
+      </w:tr>
+      <w:tr>
+        <w:tc>
+          <w:tcPr>
+            <w:tcW w:type="dxa" w:w="2880"/>
+          </w:tcPr>
+          <w:p>
+            <w:r>
+              <w:t>Sahil Tuladhar</w:t>
+            </w:r>
+          </w:p>
+        </w:tc>
+        <w:tc>
+          <w:tcPr>
+            <w:tcW w:type="dxa" w:w="2880"/>
+          </w:tcPr>
+          <w:p>
+            <w:r>
+              <w:t>Backend Developer</w:t>
+            </w:r>
+          </w:p>
+        </w:tc>
+        <w:tc>
+          <w:tcPr>
+            <w:tcW w:type="dxa" w:w="2880"/>
+          </w:tcPr>
+          <w:p>
+            <w:r>
+              <w:t>Implemented Cloudinary direct upload utility and Firestore data sync.</w:t>
+            </w:r>
+          </w:p>
+        </w:tc>
+      </w:tr>
+      <w:tr>
+        <w:tc>
+          <w:tcPr>
+            <w:tcW w:type="dxa" w:w="2880"/>
+          </w:tcPr>
+          <w:p>
+            <w:r>
+              <w:t>Sarang Limbu</w:t>
+            </w:r>
+          </w:p>
+        </w:tc>
+        <w:tc>
+          <w:tcPr>
+            <w:tcW w:type="dxa" w:w="2880"/>
+          </w:tcPr>
+          <w:p>
+            <w:r>
+              <w:t>Frontend Developer</w:t>
+            </w:r>
+          </w:p>
+        </w:tc>
+        <w:tc>
+          <w:tcPr>
+            <w:tcW w:type="dxa" w:w="2880"/>
+          </w:tcPr>
+          <w:p>
+            <w:r>
+              <w:t>Refactored form components for live image previews from Cloudinary URLs.</w:t>
+            </w:r>
+          </w:p>
+        </w:tc>
+      </w:tr>
+      <w:tr>
+        <w:tc>
+          <w:tcPr>
+            <w:tcW w:type="dxa" w:w="2880"/>
+          </w:tcPr>
+          <w:p>
+            <w:r>
+              <w:t>Sanskriti Maharjan</w:t>
+            </w:r>
+          </w:p>
+        </w:tc>
+        <w:tc>
+          <w:tcPr>
+            <w:tcW w:type="dxa" w:w="2880"/>
+          </w:tcPr>
+          <w:p>
+            <w:r>
+              <w:t>UI Component Developer</w:t>
+            </w:r>
+          </w:p>
+        </w:tc>
+        <w:tc>
+          <w:tcPr>
+            <w:tcW w:type="dxa" w:w="2880"/>
+          </w:tcPr>
+          <w:p>
+            <w:r>
+              <w:t>Rebuilt form loading states during asynchronous uploads.</w:t>
+            </w:r>
+          </w:p>
+        </w:tc>
+      </w:tr>
+      <w:tr>
+        <w:tc>
+          <w:tcPr>
+            <w:tcW w:type="dxa" w:w="2880"/>
+          </w:tcPr>
+          <w:p>
+            <w:r>
+              <w:t>Smriti Tamang</w:t>
+            </w:r>
+          </w:p>
+        </w:tc>
+        <w:tc>
+          <w:tcPr>
+            <w:tcW w:type="dxa" w:w="2880"/>
+          </w:tcPr>
+          <w:p>
+            <w:r>
+              <w:t>QA &amp; Testing</w:t>
+            </w:r>
+          </w:p>
+        </w:tc>
+        <w:tc>
+          <w:tcPr>
+            <w:tcW w:type="dxa" w:w="2880"/>
+          </w:tcPr>
+          <w:p>
+            <w:r>
+              <w:t>Verified image uploads and confirmed live data fetches from Firestore.</w:t>
+            </w:r>
+          </w:p>
+        </w:tc>
+      </w:tr>
+    </w:tbl>
+    <w:p>
+      <w:pPr>
+        <w:pStyle w:val="Heading2"/>
+        <w:pageBreakBefore/>
+      </w:pPr>
+      <w:r>
         <w:t>PROJECT OUTLOOK &amp; REMAINING TASKS</w:t>
       </w:r>
     </w:p>
     <w:p>
       <w:r>
-        <w:t xml:space="preserve">While the </w:t>
-      </w:r>
-      <w:r>
-        <w:t>frontend and UI/UX flows are 100% complete, there are a few critical milestones left before the final launch of ShopEase Nepal:</w:t>
-      </w:r>
-    </w:p>
-    <w:p>
-      <w:pPr>
-        <w:pStyle w:val="Heading1"/>
-        <w:rPr>
-          <w:color w:val="auto"/>
-        </w:rPr>
-      </w:pPr>
-      <w:r>
-        <w:rPr>
-          <w:color w:val="auto"/>
-        </w:rPr>
+        <w:t>While the frontend and UI/UX flows are 100% complete, there are a few critical milestones left before the final launch of ShopEase Nepal:</w:t>
+      </w:r>
+    </w:p>
+    <w:p>
+      <w:pPr>
+        <w:pStyle w:val="Heading3"/>
+      </w:pPr>
+      <w:r>
         <w:t>1. Database Architecture &amp; Setup</w:t>
       </w:r>
     </w:p>
@@ -3765,10 +4070,7 @@
         <w:pStyle w:val="ListBullet"/>
       </w:pPr>
       <w:r>
-        <w:t>Designing and provisioning the primary relational database (e.g., MySQL or PostgreSQL) to store</w:t>
-      </w:r>
-      <w:r>
-        <w:t xml:space="preserve"> users, products, orders, and wishlist data.</w:t>
+        <w:t>- COMPLETED: Transitioned from mock static data and local storage to a live Firebase Firestore database.</w:t>
       </w:r>
     </w:p>
     <w:p>
@@ -3776,20 +4078,14 @@
         <w:pStyle w:val="ListBullet"/>
       </w:pPr>
       <w:r>
-        <w:t>Establishing secure connections and data models mapping directly to the frontend schemas.</w:t>
-      </w:r>
-    </w:p>
-    <w:p>
-      <w:pPr>
-        <w:pStyle w:val="Heading1"/>
-        <w:rPr>
-          <w:color w:val="auto"/>
-        </w:rPr>
-      </w:pPr>
-      <w:r>
-        <w:rPr>
-          <w:color w:val="auto"/>
-        </w:rPr>
+        <w:t>- COMPLETED: Integrated Cloudinary for secure, direct image uploads across Admin and Seller dashboards.</w:t>
+      </w:r>
+    </w:p>
+    <w:p>
+      <w:pPr>
+        <w:pStyle w:val="Heading3"/>
+      </w:pPr>
+      <w:r>
         <w:t>2. Backend REST API Integration</w:t>
       </w:r>
     </w:p>
@@ -3798,10 +4094,15 @@
         <w:pStyle w:val="ListBullet"/>
       </w:pPr>
       <w:r>
-        <w:t>Currently, the application relies on mock static data and local storage for authenticatio</w:t>
-      </w:r>
-      <w:r>
-        <w:t>n, cart, and product management. The next major phase will connect the frontend to a live backend database.</w:t>
+        <w:t>- The frontend is now successfully connected to live cloud services (Firebase/Cloudinary), handling User Auth, Product CRUD, and Image hosting.</w:t>
+      </w:r>
+    </w:p>
+    <w:p>
+      <w:pPr>
+        <w:pStyle w:val="Heading3"/>
+      </w:pPr>
+      <w:r>
+        <w:t>3. Payment Gateway Setup</w:t>
       </w:r>
     </w:p>
     <w:p>
@@ -3809,21 +4110,15 @@
         <w:pStyle w:val="ListBullet"/>
       </w:pPr>
       <w:r>
-        <w:t>Endpoints to integrate include: User Auth, Admin Product CRUD, Order Processing, and Wishlist syncing.</w:t>
-      </w:r>
-    </w:p>
-    <w:p>
-      <w:pPr>
-        <w:pStyle w:val="Heading1"/>
-        <w:rPr>
-          <w:color w:val="auto"/>
-        </w:rPr>
-      </w:pPr>
-      <w:r>
-        <w:rPr>
-          <w:color w:val="auto"/>
-        </w:rPr>
-        <w:t>3. Payment Gateway Setup</w:t>
+        <w:t>Integrating Khalti and e-Sewa payment APIs to process real transactions during the checkout flow.</w:t>
+      </w:r>
+    </w:p>
+    <w:p>
+      <w:pPr>
+        <w:pStyle w:val="Heading3"/>
+      </w:pPr>
+      <w:r>
+        <w:t>4. Production Deployment</w:t>
       </w:r>
     </w:p>
     <w:p>
@@ -3831,24 +4126,7 @@
         <w:pStyle w:val="ListBullet"/>
       </w:pPr>
       <w:r>
-        <w:t>Integrating Khalti a</w:t>
-      </w:r>
-      <w:r>
-        <w:t>nd e-Sewa payment APIs to process real transactions during the checkout flow.</w:t>
-      </w:r>
-    </w:p>
-    <w:p>
-      <w:pPr>
-        <w:pStyle w:val="Heading1"/>
-        <w:rPr>
-          <w:color w:val="auto"/>
-        </w:rPr>
-      </w:pPr>
-      <w:r>
-        <w:rPr>
-          <w:color w:val="auto"/>
-        </w:rPr>
-        <w:t>4. Production Deployment</w:t>
+        <w:t>Configuring GitHub Pages or a dedicated hosting environment (like Vercel/Netlify) for public access.</w:t>
       </w:r>
     </w:p>
     <w:p>
@@ -3856,20 +4134,7 @@
         <w:pStyle w:val="ListBullet"/>
       </w:pPr>
       <w:r>
-        <w:t>Configuring GitHub Pages or a dedicated hosting environment (like Vercel/Netlify) for public access.</w:t>
-      </w:r>
-    </w:p>
-    <w:p>
-      <w:pPr>
-        <w:pStyle w:val="ListBullet"/>
-      </w:pPr>
-      <w:bookmarkStart w:id="0" w:name="_GoBack"/>
-      <w:bookmarkEnd w:id="0"/>
-      <w:r>
-        <w:t>Setting up automated CI/CD pipelines via GitHub Acti</w:t>
-      </w:r>
-      <w:r>
-        <w:t>ons for continuous deployment.</w:t>
+        <w:t>Setting up automated CI/CD pipelines via GitHub Actions for continuous deployment.</w:t>
       </w:r>
     </w:p>
     <w:sectPr>

</xml_diff>